<commit_message>
Adjust homework page length to ~4 pages per lesson
Co-authored-by: Lin Silentium <decemberlin54-del@users.noreply.github.com>
</commit_message>
<xml_diff>
--- a/第六单元课后作业/第21课 小圣施威降大圣 课后作业及答案.docx
+++ b/第六单元课后作业/第21课 小圣施威降大圣 课后作业及答案.docx
@@ -49,7 +49,7 @@
           <w:b/>
           <w:sz w:val="28"/>
         </w:rPr>
-        <w:t>一、积累与运用（每题2分，共10分）</w:t>
+        <w:t>一、积累与运用（共10分）</w:t>
       </w:r>
     </w:p>
     <w:p>
@@ -63,7 +63,7 @@
           <w:b w:val="0"/>
           <w:sz w:val="24"/>
         </w:rPr>
-        <w:t>阅读下面文字，完成1—5题。</w:t>
+        <w:t>阅读选段，完成1—5题。</w:t>
       </w:r>
     </w:p>
     <w:p>
@@ -77,7 +77,7 @@
           <w:b w:val="0"/>
           <w:sz w:val="24"/>
         </w:rPr>
-        <w:t>却说真君与大圣变做法天象地的规模，正斗时，大圣忽见本营中妖猴惊散，自觉心慌，收了法象，掣棒抽身就走。将近洞口，正撞着康、张、姚、李四太尉、郭申、直健二将军，一齐帅众挡住道："泼猴，那里走！"大圣慌了手脚，就把金箍棒捏做绣花针，藏在耳内，摇身一变，变作个麻雀儿，飞在树梢头钉住。</w:t>
+        <w:t>大圣把金箍棒捏做绣花针，藏在耳内，摇身一变，变作个麻雀儿，飞在树梢头钉住。</w:t>
       </w:r>
     </w:p>
     <w:p>
@@ -91,7 +91,7 @@
           <w:b w:val="0"/>
           <w:sz w:val="24"/>
         </w:rPr>
-        <w:t>1. 文中加点字"掣"的读音和意思正确的一项是（  ）</w:t>
+        <w:t>1."掣棒"的"掣"读音和意思：A.chè拉、抽 B.zhì扔 C.chè跑 D.zhì举</w:t>
       </w:r>
     </w:p>
     <w:p>
@@ -105,7 +105,7 @@
           <w:b w:val="0"/>
           <w:sz w:val="24"/>
         </w:rPr>
-        <w:t>A. chè  拉、抽    B. zhì  扔、抛    C. chè  跑、逃    D. zhì  举、拿</w:t>
+        <w:t>2.书写正确：A.木木樗樗 法天象地 渺无踪迹 B.木木樗樗 法天像地</w:t>
       </w:r>
     </w:p>
     <w:p>
@@ -119,7 +119,7 @@
           <w:b w:val="0"/>
           <w:sz w:val="24"/>
         </w:rPr>
-        <w:t>2. 下列词语书写完全正确的一项是（  ）</w:t>
+        <w:t>3."只情"的"情"：A.感情 B.情况 C.只管 D.情形</w:t>
       </w:r>
     </w:p>
     <w:p>
@@ -133,7 +133,7 @@
           <w:b w:val="0"/>
           <w:sz w:val="24"/>
         </w:rPr>
-        <w:t>A. 木木樗樗  法天象地  渺无踪迹    B. 木木樗樗  法天像地  渺无踪迹</w:t>
+        <w:t>4.没有语病：A.通过梳理使我们理解 B.斗法展现想象力 C.能否默读是标准 D.作者罗贯中</w:t>
       </w:r>
     </w:p>
     <w:p>
@@ -147,147 +147,7 @@
           <w:b w:val="0"/>
           <w:sz w:val="24"/>
         </w:rPr>
-        <w:t>C. 木木疏疏  法天象地  渺无踪影    D. 木木樗樗  法天象地  渺无踪影</w:t>
-      </w:r>
-    </w:p>
-    <w:p>
-      <w:pPr>
-        <w:spacing w:line="360" w:lineRule="auto"/>
-        <w:ind w:firstLine="420"/>
-      </w:pPr>
-      <w:r>
-        <w:rPr>
-          <w:rFonts w:ascii="宋体" w:hAnsi="宋体" w:eastAsia="宋体"/>
-          <w:b w:val="0"/>
-          <w:sz w:val="24"/>
-        </w:rPr>
-        <w:t>3. 文中"只情跑起"的"情"意思是（  ）</w:t>
-      </w:r>
-    </w:p>
-    <w:p>
-      <w:pPr>
-        <w:spacing w:line="360" w:lineRule="auto"/>
-        <w:ind w:firstLine="420"/>
-      </w:pPr>
-      <w:r>
-        <w:rPr>
-          <w:rFonts w:ascii="宋体" w:hAnsi="宋体" w:eastAsia="宋体"/>
-          <w:b w:val="0"/>
-          <w:sz w:val="24"/>
-        </w:rPr>
-        <w:t>A. 感情  B. 情况  C. 只管、只顾  D. 情形</w:t>
-      </w:r>
-    </w:p>
-    <w:p>
-      <w:pPr>
-        <w:spacing w:line="360" w:lineRule="auto"/>
-        <w:ind w:firstLine="420"/>
-      </w:pPr>
-      <w:r>
-        <w:rPr>
-          <w:rFonts w:ascii="宋体" w:hAnsi="宋体" w:eastAsia="宋体"/>
-          <w:b w:val="0"/>
-          <w:sz w:val="24"/>
-        </w:rPr>
-        <w:t>4. 下列句子没有语病的一项是（  ）</w:t>
-      </w:r>
-    </w:p>
-    <w:p>
-      <w:pPr>
-        <w:spacing w:line="360" w:lineRule="auto"/>
-        <w:ind w:firstLine="420"/>
-      </w:pPr>
-      <w:r>
-        <w:rPr>
-          <w:rFonts w:ascii="宋体" w:hAnsi="宋体" w:eastAsia="宋体"/>
-          <w:b w:val="0"/>
-          <w:sz w:val="24"/>
-        </w:rPr>
-        <w:t>A. 通过梳理斗法过程，使我们理解了神魔小说的想象艺术。</w:t>
-      </w:r>
-    </w:p>
-    <w:p>
-      <w:pPr>
-        <w:spacing w:line="360" w:lineRule="auto"/>
-        <w:ind w:firstLine="420"/>
-      </w:pPr>
-      <w:r>
-        <w:rPr>
-          <w:rFonts w:ascii="宋体" w:hAnsi="宋体" w:eastAsia="宋体"/>
-          <w:b w:val="0"/>
-          <w:sz w:val="24"/>
-        </w:rPr>
-        <w:t>B. 孙悟空与二郎神的斗法，展现了作者非凡的想象力。</w:t>
-      </w:r>
-    </w:p>
-    <w:p>
-      <w:pPr>
-        <w:spacing w:line="360" w:lineRule="auto"/>
-        <w:ind w:firstLine="420"/>
-      </w:pPr>
-      <w:r>
-        <w:rPr>
-          <w:rFonts w:ascii="宋体" w:hAnsi="宋体" w:eastAsia="宋体"/>
-          <w:b w:val="0"/>
-          <w:sz w:val="24"/>
-        </w:rPr>
-        <w:t>C. 能否快速默读，是衡量阅读能力高低的重要标准之一。</w:t>
-      </w:r>
-    </w:p>
-    <w:p>
-      <w:pPr>
-        <w:spacing w:line="360" w:lineRule="auto"/>
-        <w:ind w:firstLine="420"/>
-      </w:pPr>
-      <w:r>
-        <w:rPr>
-          <w:rFonts w:ascii="宋体" w:hAnsi="宋体" w:eastAsia="宋体"/>
-          <w:b w:val="0"/>
-          <w:sz w:val="24"/>
-        </w:rPr>
-        <w:t>D. 这篇课文选自《西游记》，作者是明代的罗贯中。</w:t>
-      </w:r>
-    </w:p>
-    <w:p>
-      <w:pPr>
-        <w:spacing w:line="360" w:lineRule="auto"/>
-        <w:ind w:firstLine="420"/>
-      </w:pPr>
-      <w:r>
-        <w:rPr>
-          <w:rFonts w:ascii="宋体" w:hAnsi="宋体" w:eastAsia="宋体"/>
-          <w:b w:val="0"/>
-          <w:sz w:val="24"/>
-        </w:rPr>
-        <w:t>5. 将下列情节按发生顺序排列，最恰当的一项是（  ）</w:t>
-      </w:r>
-    </w:p>
-    <w:p>
-      <w:pPr>
-        <w:spacing w:line="360" w:lineRule="auto"/>
-        <w:ind w:firstLine="420"/>
-      </w:pPr>
-      <w:r>
-        <w:rPr>
-          <w:rFonts w:ascii="宋体" w:hAnsi="宋体" w:eastAsia="宋体"/>
-          <w:b w:val="0"/>
-          <w:sz w:val="24"/>
-        </w:rPr>
-        <w:t>①变作二郎模样进入灌江口庙宇  ②变土地庙，尾巴变旗竿  ③变麻雀钉在树梢  ④败走遇四太尉二将军阻挡</w:t>
-      </w:r>
-    </w:p>
-    <w:p>
-      <w:pPr>
-        <w:spacing w:line="360" w:lineRule="auto"/>
-        <w:ind w:firstLine="420"/>
-      </w:pPr>
-      <w:r>
-        <w:rPr>
-          <w:rFonts w:ascii="宋体" w:hAnsi="宋体" w:eastAsia="宋体"/>
-          <w:b w:val="0"/>
-          <w:sz w:val="24"/>
-        </w:rPr>
-        <w:t>A. ④③②①  B. ③④②①  C. ④②③①  D. ③②④①</w:t>
+        <w:t>5.排序：①变二郎入庙 ②变土地庙 ③变麻雀 ④败走被挡 → A.④③②①</w:t>
       </w:r>
     </w:p>
     <w:p>
@@ -311,7 +171,7 @@
           <w:b w:val="0"/>
           <w:sz w:val="24"/>
         </w:rPr>
-        <w:t>6. 《西游记》的作者是________，他生活在________（填朝代）。本文选自第________回。</w:t>
+        <w:t>6.作者________ 朝代________ 选自第________回</w:t>
       </w:r>
     </w:p>
     <w:p>
@@ -325,7 +185,7 @@
           <w:b w:val="0"/>
           <w:sz w:val="24"/>
         </w:rPr>
-        <w:t>7. 孙悟空还有哪些经典情节？请写出两个：①________  ②________</w:t>
+        <w:t>7.孙悟空经典情节两个：________、________</w:t>
       </w:r>
     </w:p>
     <w:p>
@@ -339,20 +199,7 @@
           <w:b w:val="0"/>
           <w:sz w:val="24"/>
         </w:rPr>
-        <w:t>8. 假如学校文学社制作"名著人物智慧卡"，你会推荐孙悟空还是二郎神？请结合本文说说理由。（不少于60字）</w:t>
-      </w:r>
-    </w:p>
-    <w:p>
-      <w:pPr>
-        <w:spacing w:line="360" w:lineRule="auto"/>
-      </w:pPr>
-      <w:r>
-        <w:rPr>
-          <w:rFonts w:ascii="宋体" w:hAnsi="宋体" w:eastAsia="宋体"/>
-          <w:b w:val="0"/>
-          <w:sz w:val="24"/>
-        </w:rPr>
-        <w:t>__________________________________________________________</w:t>
+        <w:t>8.推荐孙悟空或二郎神，结合本文说理由（60字以上）</w:t>
       </w:r>
     </w:p>
     <w:p>
@@ -402,48 +249,7 @@
           <w:b w:val="0"/>
           <w:sz w:val="24"/>
         </w:rPr>
-        <w:t>阅读课文选段，完成9—12题。</w:t>
-      </w:r>
-    </w:p>
-    <w:p>
-      <w:pPr>
-        <w:spacing w:line="360" w:lineRule="auto"/>
-        <w:ind w:firstLine="420"/>
-      </w:pPr>
-      <w:r>
-        <w:rPr>
-          <w:rFonts w:ascii="宋体" w:hAnsi="宋体" w:eastAsia="宋体"/>
-          <w:b w:val="0"/>
-          <w:sz w:val="24"/>
-        </w:rPr>
-        <w:t>那大圣趁着机会，滚下山崖，伏在那里又变，变了一座土地庙儿，大张着口，似个庙门，牙齿变做门扇，舌头变做菩萨，眼睛变做窗棂。只有尾巴不好收拾，竖在后面，变做一根旗竿。真君赶到崖下，不见打倒的鸨鸟，只有一间小庙，急睁凤眼，仔细看之，见旗竿立在后面，笑道：是这猢狲了！</w:t>
-      </w:r>
-    </w:p>
-    <w:p>
-      <w:pPr>
-        <w:spacing w:line="360" w:lineRule="auto"/>
-        <w:ind w:firstLine="420"/>
-      </w:pPr>
-      <w:r>
-        <w:rPr>
-          <w:rFonts w:ascii="宋体" w:hAnsi="宋体" w:eastAsia="宋体"/>
-          <w:b w:val="0"/>
-          <w:sz w:val="24"/>
-        </w:rPr>
-        <w:t>9. 用简洁的语言概括选段主要内容。（不超过40字）</w:t>
-      </w:r>
-    </w:p>
-    <w:p>
-      <w:pPr>
-        <w:spacing w:line="360" w:lineRule="auto"/>
-      </w:pPr>
-      <w:r>
-        <w:rPr>
-          <w:rFonts w:ascii="宋体" w:hAnsi="宋体" w:eastAsia="宋体"/>
-          <w:b w:val="0"/>
-          <w:sz w:val="24"/>
-        </w:rPr>
-        <w:t>__________________________________________________________</w:t>
+        <w:t>9.概括"变土地庙"选段（40字内）</w:t>
       </w:r>
     </w:p>
     <w:p>
@@ -483,7 +289,7 @@
           <w:b w:val="0"/>
           <w:sz w:val="24"/>
         </w:rPr>
-        <w:t>10. 孙悟空把尾巴变成旗竿，这一细节有什么作用？（4分）</w:t>
+        <w:t>10.尾巴变旗竿的细节作用（4分）</w:t>
       </w:r>
     </w:p>
     <w:p>
@@ -523,7 +329,7 @@
           <w:b w:val="0"/>
           <w:sz w:val="24"/>
         </w:rPr>
-        <w:t>11. 结合课文，分别概括孙悟空和二郎神的性格特点，并各举一处课文依据。（4分）</w:t>
+        <w:t>11.概括孙悟空、二郎神性格并各举依据（4分）</w:t>
       </w:r>
     </w:p>
     <w:p>
@@ -563,7 +369,43 @@
           <w:b w:val="0"/>
           <w:sz w:val="24"/>
         </w:rPr>
-        <w:t>12. 阅读下面名家评论，完成问题。（4分）</w:t>
+        <w:t>12.鲁迅说"使神魔皆有人情"——课文何处最能体现？（4分）</w:t>
+      </w:r>
+    </w:p>
+    <w:p>
+      <w:pPr>
+        <w:spacing w:line="360" w:lineRule="auto"/>
+      </w:pPr>
+      <w:r>
+        <w:rPr>
+          <w:rFonts w:ascii="宋体" w:hAnsi="宋体" w:eastAsia="宋体"/>
+          <w:b w:val="0"/>
+          <w:sz w:val="24"/>
+        </w:rPr>
+        <w:t>__________________________________________________________</w:t>
+      </w:r>
+    </w:p>
+    <w:p>
+      <w:pPr>
+        <w:spacing w:line="360" w:lineRule="auto"/>
+      </w:pPr>
+      <w:r>
+        <w:rPr>
+          <w:rFonts w:ascii="宋体" w:hAnsi="宋体" w:eastAsia="宋体"/>
+          <w:b w:val="0"/>
+          <w:sz w:val="24"/>
+        </w:rPr>
+        <w:t>__________________________________________________________</w:t>
+      </w:r>
+    </w:p>
+    <w:p>
+      <w:r>
+        <w:rPr>
+          <w:rFonts w:ascii="黑体" w:hAnsi="黑体" w:eastAsia="黑体"/>
+          <w:b/>
+          <w:sz w:val="28"/>
+        </w:rPr>
+        <w:t>四、语言运用（共10分）</w:t>
       </w:r>
     </w:p>
     <w:p>
@@ -577,34 +419,7 @@
           <w:b w:val="0"/>
           <w:sz w:val="24"/>
         </w:rPr>
-        <w:t>鲁迅说："虽述变幻恍忽之事，亦每杂解颐之言，使神魔皆有人情，精魅亦通世故。"</w:t>
-      </w:r>
-    </w:p>
-    <w:p>
-      <w:pPr>
-        <w:spacing w:line="360" w:lineRule="auto"/>
-        <w:ind w:firstLine="420"/>
-      </w:pPr>
-      <w:r>
-        <w:rPr>
-          <w:rFonts w:ascii="宋体" w:hAnsi="宋体" w:eastAsia="宋体"/>
-          <w:b w:val="0"/>
-          <w:sz w:val="24"/>
-        </w:rPr>
-        <w:t>（1）这句话指出了《西游记》怎样的艺术特点？</w:t>
-      </w:r>
-    </w:p>
-    <w:p>
-      <w:pPr>
-        <w:spacing w:line="360" w:lineRule="auto"/>
-      </w:pPr>
-      <w:r>
-        <w:rPr>
-          <w:rFonts w:ascii="宋体" w:hAnsi="宋体" w:eastAsia="宋体"/>
-          <w:b w:val="0"/>
-          <w:sz w:val="24"/>
-        </w:rPr>
-        <w:t>__________________________________________________________</w:t>
+        <w:t>13.写80字推荐语，点明想象特色，联系"自由与规则"</w:t>
       </w:r>
     </w:p>
     <w:p>
@@ -644,186 +459,7 @@
           <w:b w:val="0"/>
           <w:sz w:val="24"/>
         </w:rPr>
-        <w:t>（2）课文中的哪一处情节最能体现"游戏般的童话气氛"？请举例说明。</w:t>
-      </w:r>
-    </w:p>
-    <w:p>
-      <w:pPr>
-        <w:spacing w:line="360" w:lineRule="auto"/>
-      </w:pPr>
-      <w:r>
-        <w:rPr>
-          <w:rFonts w:ascii="宋体" w:hAnsi="宋体" w:eastAsia="宋体"/>
-          <w:b w:val="0"/>
-          <w:sz w:val="24"/>
-        </w:rPr>
-        <w:t>__________________________________________________________</w:t>
-      </w:r>
-    </w:p>
-    <w:p>
-      <w:pPr>
-        <w:spacing w:line="360" w:lineRule="auto"/>
-      </w:pPr>
-      <w:r>
-        <w:rPr>
-          <w:rFonts w:ascii="宋体" w:hAnsi="宋体" w:eastAsia="宋体"/>
-          <w:b w:val="0"/>
-          <w:sz w:val="24"/>
-        </w:rPr>
-        <w:t>__________________________________________________________</w:t>
-      </w:r>
-    </w:p>
-    <w:p>
-      <w:r>
-        <w:rPr>
-          <w:rFonts w:ascii="黑体" w:hAnsi="黑体" w:eastAsia="黑体"/>
-          <w:b/>
-          <w:sz w:val="28"/>
-        </w:rPr>
-        <w:t>四、语言运用（共6分）</w:t>
-      </w:r>
-    </w:p>
-    <w:p>
-      <w:pPr>
-        <w:spacing w:line="360" w:lineRule="auto"/>
-        <w:ind w:firstLine="420"/>
-      </w:pPr>
-      <w:r>
-        <w:rPr>
-          <w:rFonts w:ascii="宋体" w:hAnsi="宋体" w:eastAsia="宋体"/>
-          <w:b w:val="0"/>
-          <w:sz w:val="24"/>
-        </w:rPr>
-        <w:t>13. 班级开展"神魔小说大家谈"活动，请你为《小圣施威降大圣》写一段80字左右的推荐语，要求：点明想象特色，联系"自由与规则"的思考。</w:t>
-      </w:r>
-    </w:p>
-    <w:p>
-      <w:pPr>
-        <w:spacing w:line="360" w:lineRule="auto"/>
-      </w:pPr>
-      <w:r>
-        <w:rPr>
-          <w:rFonts w:ascii="宋体" w:hAnsi="宋体" w:eastAsia="宋体"/>
-          <w:b w:val="0"/>
-          <w:sz w:val="24"/>
-        </w:rPr>
-        <w:t>__________________________________________________________</w:t>
-      </w:r>
-    </w:p>
-    <w:p>
-      <w:pPr>
-        <w:spacing w:line="360" w:lineRule="auto"/>
-      </w:pPr>
-      <w:r>
-        <w:rPr>
-          <w:rFonts w:ascii="宋体" w:hAnsi="宋体" w:eastAsia="宋体"/>
-          <w:b w:val="0"/>
-          <w:sz w:val="24"/>
-        </w:rPr>
-        <w:t>__________________________________________________________</w:t>
-      </w:r>
-    </w:p>
-    <w:p>
-      <w:pPr>
-        <w:spacing w:line="360" w:lineRule="auto"/>
-        <w:ind w:firstLine="420"/>
-      </w:pPr>
-      <w:r>
-        <w:rPr>
-          <w:rFonts w:ascii="宋体" w:hAnsi="宋体" w:eastAsia="宋体"/>
-          <w:b w:val="0"/>
-          <w:sz w:val="24"/>
-        </w:rPr>
-        <w:t>14. 情境默写：当同学争论"规则是否限制自由"时，你可以引用本课内容说：孙悟空神通广大，却也在天庭规则与二郎神的追捕中懂得________。这启示我们：________。</w:t>
-      </w:r>
-    </w:p>
-    <w:p>
-      <w:pPr>
-        <w:spacing w:line="360" w:lineRule="auto"/>
-      </w:pPr>
-      <w:r>
-        <w:rPr>
-          <w:rFonts w:ascii="宋体" w:hAnsi="宋体" w:eastAsia="宋体"/>
-          <w:b w:val="0"/>
-          <w:sz w:val="24"/>
-        </w:rPr>
-        <w:t>__________________________________________________________</w:t>
-      </w:r>
-    </w:p>
-    <w:p>
-      <w:pPr>
-        <w:spacing w:line="360" w:lineRule="auto"/>
-      </w:pPr>
-      <w:r>
-        <w:rPr>
-          <w:rFonts w:ascii="宋体" w:hAnsi="宋体" w:eastAsia="宋体"/>
-          <w:b w:val="0"/>
-          <w:sz w:val="24"/>
-        </w:rPr>
-        <w:t>__________________________________________________________</w:t>
-      </w:r>
-    </w:p>
-    <w:p>
-      <w:pPr>
-        <w:spacing w:line="360" w:lineRule="auto"/>
-      </w:pPr>
-      <w:r>
-        <w:rPr>
-          <w:rFonts w:ascii="宋体" w:hAnsi="宋体" w:eastAsia="宋体"/>
-          <w:b w:val="0"/>
-          <w:sz w:val="24"/>
-        </w:rPr>
-        <w:t>__________________________________________________________</w:t>
-      </w:r>
-    </w:p>
-    <w:p>
-      <w:r>
-        <w:rPr>
-          <w:rFonts w:ascii="黑体" w:hAnsi="黑体" w:eastAsia="黑体"/>
-          <w:b/>
-          <w:sz w:val="28"/>
-        </w:rPr>
-        <w:t>五、小练笔（共4分）</w:t>
-      </w:r>
-    </w:p>
-    <w:p>
-      <w:pPr>
-        <w:spacing w:line="360" w:lineRule="auto"/>
-        <w:ind w:firstLine="420"/>
-      </w:pPr>
-      <w:r>
-        <w:rPr>
-          <w:rFonts w:ascii="宋体" w:hAnsi="宋体" w:eastAsia="宋体"/>
-          <w:b w:val="0"/>
-          <w:sz w:val="24"/>
-        </w:rPr>
-        <w:t>15. 课文结尾，孙悟空变作二郎真君模样。假如你是二郎神，你会如何识破？发挥合理想象，写一段不少于100字的文字。</w:t>
-      </w:r>
-    </w:p>
-    <w:p>
-      <w:pPr>
-        <w:spacing w:line="360" w:lineRule="auto"/>
-      </w:pPr>
-      <w:r>
-        <w:rPr>
-          <w:rFonts w:ascii="宋体" w:hAnsi="宋体" w:eastAsia="宋体"/>
-          <w:b w:val="0"/>
-          <w:sz w:val="24"/>
-        </w:rPr>
-        <w:t>__________________________________________________________</w:t>
-      </w:r>
-    </w:p>
-    <w:p>
-      <w:pPr>
-        <w:spacing w:line="360" w:lineRule="auto"/>
-      </w:pPr>
-      <w:r>
-        <w:rPr>
-          <w:rFonts w:ascii="宋体" w:hAnsi="宋体" w:eastAsia="宋体"/>
-          <w:b w:val="0"/>
-          <w:sz w:val="24"/>
-        </w:rPr>
-        <w:t>__________________________________________________________</w:t>
+        <w:t>14.续写：二郎神如何识破悟空变庙宇（100字以上）</w:t>
       </w:r>
     </w:p>
     <w:p>
@@ -853,7 +489,6 @@
       </w:r>
     </w:p>
     <w:p/>
-    <w:p/>
     <w:p>
       <w:r>
         <w:rPr>
@@ -871,7 +506,17 @@
           <w:b/>
           <w:sz w:val="24"/>
         </w:rPr>
-        <w:t>一、积累与运用</w:t>
+        <w:t>一、1.A 2.A 3.C 4.B 5.A</w:t>
+      </w:r>
+    </w:p>
+    <w:p>
+      <w:r>
+        <w:rPr>
+          <w:rFonts w:ascii="黑体" w:hAnsi="黑体" w:eastAsia="黑体"/>
+          <w:b/>
+          <w:sz w:val="24"/>
+        </w:rPr>
+        <w:t>二、6.吴承恩；明代；六 7.大闹天宫；三借芭蕉扇等</w:t>
       </w:r>
     </w:p>
     <w:p>
@@ -885,63 +530,7 @@
           <w:b w:val="0"/>
           <w:sz w:val="24"/>
         </w:rPr>
-        <w:t>1.A  【解析】本题考查字音字义。"掣"读chè，意为拉、抽，"掣棒"即抽棒。</w:t>
-      </w:r>
-    </w:p>
-    <w:p>
-      <w:pPr>
-        <w:spacing w:line="360" w:lineRule="auto"/>
-        <w:ind w:firstLine="420"/>
-      </w:pPr>
-      <w:r>
-        <w:rPr>
-          <w:rFonts w:ascii="宋体" w:hAnsi="宋体" w:eastAsia="宋体"/>
-          <w:b w:val="0"/>
-          <w:sz w:val="24"/>
-        </w:rPr>
-        <w:t>2.A  【解析】本题考查字形。"法天象地"的"象"指景象，不可写作"像"；"木木樗樗"形容呆板、丑陋。</w:t>
-      </w:r>
-    </w:p>
-    <w:p>
-      <w:pPr>
-        <w:spacing w:line="360" w:lineRule="auto"/>
-        <w:ind w:firstLine="420"/>
-      </w:pPr>
-      <w:r>
-        <w:rPr>
-          <w:rFonts w:ascii="宋体" w:hAnsi="宋体" w:eastAsia="宋体"/>
-          <w:b w:val="0"/>
-          <w:sz w:val="24"/>
-        </w:rPr>
-        <w:t>3.C  【解析】本题考查古今异义/通假。"只情"即"只管"，与课下注释一致。</w:t>
-      </w:r>
-    </w:p>
-    <w:p>
-      <w:pPr>
-        <w:spacing w:line="360" w:lineRule="auto"/>
-        <w:ind w:firstLine="420"/>
-      </w:pPr>
-      <w:r>
-        <w:rPr>
-          <w:rFonts w:ascii="宋体" w:hAnsi="宋体" w:eastAsia="宋体"/>
-          <w:b w:val="0"/>
-          <w:sz w:val="24"/>
-        </w:rPr>
-        <w:t>4.B  【解析】A项缺主语，应删"通过"或"使"；C项两面对一面；D项作者应为吴承恩。</w:t>
-      </w:r>
-    </w:p>
-    <w:p>
-      <w:pPr>
-        <w:spacing w:line="360" w:lineRule="auto"/>
-        <w:ind w:firstLine="420"/>
-      </w:pPr>
-      <w:r>
-        <w:rPr>
-          <w:rFonts w:ascii="宋体" w:hAnsi="宋体" w:eastAsia="宋体"/>
-          <w:b w:val="0"/>
-          <w:sz w:val="24"/>
-        </w:rPr>
-        <w:t>5.A  【解析】按课文顺序：先败走被挡（④），再变麻雀（③），后变土地庙（②），最后到灌江口（①）。</w:t>
+        <w:t>8.示例：推荐孙悟空。他机智善变、临危不乱，七十二变令人叹服；也启示我们：自由可贵，但须在规则中行。</w:t>
       </w:r>
     </w:p>
     <w:p>
@@ -951,49 +540,7 @@
           <w:b/>
           <w:sz w:val="24"/>
         </w:rPr>
-        <w:t>二、名著阅读</w:t>
-      </w:r>
-    </w:p>
-    <w:p>
-      <w:pPr>
-        <w:spacing w:line="360" w:lineRule="auto"/>
-        <w:ind w:firstLine="420"/>
-      </w:pPr>
-      <w:r>
-        <w:rPr>
-          <w:rFonts w:ascii="宋体" w:hAnsi="宋体" w:eastAsia="宋体"/>
-          <w:b w:val="0"/>
-          <w:sz w:val="24"/>
-        </w:rPr>
-        <w:t>6. 吴承恩；明代；六（或"第六回"）</w:t>
-      </w:r>
-    </w:p>
-    <w:p>
-      <w:pPr>
-        <w:spacing w:line="360" w:lineRule="auto"/>
-        <w:ind w:firstLine="420"/>
-      </w:pPr>
-      <w:r>
-        <w:rPr>
-          <w:rFonts w:ascii="宋体" w:hAnsi="宋体" w:eastAsia="宋体"/>
-          <w:b w:val="0"/>
-          <w:sz w:val="24"/>
-        </w:rPr>
-        <w:t>7. 示例：大闹天宫；三借芭蕉扇；三打白骨精；真假美猴王（任写两个）</w:t>
-      </w:r>
-    </w:p>
-    <w:p>
-      <w:pPr>
-        <w:spacing w:line="360" w:lineRule="auto"/>
-        <w:ind w:firstLine="420"/>
-      </w:pPr>
-      <w:r>
-        <w:rPr>
-          <w:rFonts w:ascii="宋体" w:hAnsi="宋体" w:eastAsia="宋体"/>
-          <w:b w:val="0"/>
-          <w:sz w:val="24"/>
-        </w:rPr>
-        <w:t>8. 【示例】我推荐孙悟空。他面对二郎神追捕，能临危不乱、随机应变，由麻雀到大鹚老、鱼儿、水蛇、花鸨、土地庙，变化层出不穷；虽桀骜好胜，却机智勇敢。读这一回，既能感受想象的奇趣，也能思考自由与规则的关系。</w:t>
+        <w:t>三、9.悟空变庙，旗竿暴露被识破。10.推动情节，显幽默与游戏笔法。11.悟空机智；二郎细心（需结合课文）。12.变花鸨、变庙宇等富人情童趣。</w:t>
       </w:r>
     </w:p>
     <w:p>
@@ -1003,139 +550,7 @@
           <w:b/>
           <w:sz w:val="24"/>
         </w:rPr>
-        <w:t>三、阅读理解</w:t>
-      </w:r>
-    </w:p>
-    <w:p>
-      <w:pPr>
-        <w:spacing w:line="360" w:lineRule="auto"/>
-        <w:ind w:firstLine="420"/>
-      </w:pPr>
-      <w:r>
-        <w:rPr>
-          <w:rFonts w:ascii="宋体" w:hAnsi="宋体" w:eastAsia="宋体"/>
-          <w:b w:val="0"/>
-          <w:sz w:val="24"/>
-        </w:rPr>
-        <w:t>9. 孙悟空变作土地庙，因尾巴变旗竿暴露，被二郎神识破。（意思对即可）</w:t>
-      </w:r>
-    </w:p>
-    <w:p>
-      <w:pPr>
-        <w:spacing w:line="360" w:lineRule="auto"/>
-        <w:ind w:firstLine="420"/>
-      </w:pPr>
-      <w:r>
-        <w:rPr>
-          <w:rFonts w:ascii="宋体" w:hAnsi="宋体" w:eastAsia="宋体"/>
-          <w:b w:val="0"/>
-          <w:sz w:val="24"/>
-        </w:rPr>
-        <w:t>10. 这一细节既表现了孙悟空变化时"尾巴不好收拾"的窘迫，留下破绽，推动情节发展；又以幽默、生活化的想象制造笑点，体现神魔小说"游戏笔法"和"人情味"，使奇幻情节显得真实可感。</w:t>
-      </w:r>
-    </w:p>
-    <w:p>
-      <w:pPr>
-        <w:spacing w:line="360" w:lineRule="auto"/>
-        <w:ind w:firstLine="420"/>
-      </w:pPr>
-      <w:r>
-        <w:rPr>
-          <w:rFonts w:ascii="宋体" w:hAnsi="宋体" w:eastAsia="宋体"/>
-          <w:b w:val="0"/>
-          <w:sz w:val="24"/>
-        </w:rPr>
-        <w:t>11. 孙悟空：机智善变、桀骜不驯。依据：败走中迅速变麻雀、鱼儿等脱身。二郎神：细心谨慎、执法严明。依据：由旗竿识破土地庙，或紧追不舍、变化相克。</w:t>
-      </w:r>
-    </w:p>
-    <w:p>
-      <w:pPr>
-        <w:spacing w:line="360" w:lineRule="auto"/>
-        <w:ind w:firstLine="420"/>
-      </w:pPr>
-      <w:r>
-        <w:rPr>
-          <w:rFonts w:ascii="宋体" w:hAnsi="宋体" w:eastAsia="宋体"/>
-          <w:b w:val="0"/>
-          <w:sz w:val="24"/>
-        </w:rPr>
-        <w:t>12.（1）神魔形象具有人情味，情节在奇幻中透出幽默与生活智慧。（2）示例：孙悟空变花鸨"木木樗樗"立在蓼汀，二郎神"见他变得低贱，故此不去拢傍"，充满游戏感与儿童情趣。</w:t>
-      </w:r>
-    </w:p>
-    <w:p>
-      <w:r>
-        <w:rPr>
-          <w:rFonts w:ascii="黑体" w:hAnsi="黑体" w:eastAsia="黑体"/>
-          <w:b/>
-          <w:sz w:val="24"/>
-        </w:rPr>
-        <w:t>四、语言运用</w:t>
-      </w:r>
-    </w:p>
-    <w:p>
-      <w:pPr>
-        <w:spacing w:line="360" w:lineRule="auto"/>
-        <w:ind w:firstLine="420"/>
-      </w:pPr>
-      <w:r>
-        <w:rPr>
-          <w:rFonts w:ascii="宋体" w:hAnsi="宋体" w:eastAsia="宋体"/>
-          <w:b w:val="0"/>
-          <w:sz w:val="24"/>
-        </w:rPr>
-        <w:t>13. 【示例】《小圣施威降大圣》是一回"以变制变"的精彩斗法。作者用连环变化写出神魔世界的奇趣，也写出孙悟空的机敏与二郎神的果决。它告诉我们：追求自由应有边界，再强的本领也要在规则中行事。</w:t>
-      </w:r>
-    </w:p>
-    <w:p>
-      <w:pPr>
-        <w:spacing w:line="360" w:lineRule="auto"/>
-        <w:ind w:firstLine="420"/>
-      </w:pPr>
-      <w:r>
-        <w:rPr>
-          <w:rFonts w:ascii="宋体" w:hAnsi="宋体" w:eastAsia="宋体"/>
-          <w:b w:val="0"/>
-          <w:sz w:val="24"/>
-        </w:rPr>
-        <w:t>14. 示例：收敛与边界；自由可贵，但要在规则与责任中行使。（言之有理即可）</w:t>
-      </w:r>
-    </w:p>
-    <w:p>
-      <w:r>
-        <w:rPr>
-          <w:rFonts w:ascii="黑体" w:hAnsi="黑体" w:eastAsia="黑体"/>
-          <w:b/>
-          <w:sz w:val="24"/>
-        </w:rPr>
-        <w:t>五、小练笔</w:t>
-      </w:r>
-    </w:p>
-    <w:p>
-      <w:pPr>
-        <w:spacing w:line="360" w:lineRule="auto"/>
-        <w:ind w:firstLine="420"/>
-      </w:pPr>
-      <w:r>
-        <w:rPr>
-          <w:rFonts w:ascii="宋体" w:hAnsi="宋体" w:eastAsia="宋体"/>
-          <w:b w:val="0"/>
-          <w:sz w:val="24"/>
-        </w:rPr>
-        <w:t>15. 【示例】二郎神赶到庙前，并不急于动手，只朗声道："孙猴子，你变得倒像，却忘了灌江口庙宇向来只有香炉并无旗竿！"大圣心头一紧，正欲再变，真君已化作鹞子扑向旗竿。猴王哈哈一笑，纵云而起："二郎哥眼睛真尖！这一局算你赢半招！"二人又斗在一处。</w:t>
-      </w:r>
-    </w:p>
-    <w:p>
-      <w:pPr>
-        <w:spacing w:line="360" w:lineRule="auto"/>
-        <w:ind w:firstLine="420"/>
-      </w:pPr>
-      <w:r>
-        <w:rPr>
-          <w:rFonts w:ascii="宋体" w:hAnsi="宋体" w:eastAsia="宋体"/>
-          <w:b w:val="0"/>
-          <w:sz w:val="24"/>
-        </w:rPr>
-        <w:t>【评分建议】想象合理2分，符合人物性格1分，语言通顺1分。</w:t>
+        <w:t>四、13.示例：一回精彩斗法，既见想象奇趣，也思自由与规则。14.示例：二郎指出庙宇不该有旗竿后识破。（合理即可）</w:t>
       </w:r>
     </w:p>
     <w:sectPr>

</xml_diff>

<commit_message>
Restore fuller homework for lessons 21-22 (~5 pages)
Co-authored-by: Lin Silentium <decemberlin54-del@users.noreply.github.com>
</commit_message>
<xml_diff>
--- a/第六单元课后作业/第21课 小圣施威降大圣 课后作业及答案.docx
+++ b/第六单元课后作业/第21课 小圣施威降大圣 课后作业及答案.docx
@@ -49,7 +49,7 @@
           <w:b/>
           <w:sz w:val="28"/>
         </w:rPr>
-        <w:t>一、积累与运用（共10分）</w:t>
+        <w:t>一、积累与运用（每题2分，共10分）</w:t>
       </w:r>
     </w:p>
     <w:p>
@@ -63,7 +63,7 @@
           <w:b w:val="0"/>
           <w:sz w:val="24"/>
         </w:rPr>
-        <w:t>阅读选段，完成1—5题。</w:t>
+        <w:t>阅读下面文字，完成1—5题。</w:t>
       </w:r>
     </w:p>
     <w:p>
@@ -77,7 +77,7 @@
           <w:b w:val="0"/>
           <w:sz w:val="24"/>
         </w:rPr>
-        <w:t>大圣把金箍棒捏做绣花针，藏在耳内，摇身一变，变作个麻雀儿，飞在树梢头钉住。</w:t>
+        <w:t>却说真君与大圣变做法天象地的规模，正斗时，大圣忽见本营中妖猴惊散，自觉心慌，收了法象，掣棒抽身就走。将近洞口，正撞着康、张、姚、李四太尉、郭申、直健二将军，一齐帅众挡住道："泼猴，那里走！"大圣慌了手脚，就把金箍棒捏做绣花针，藏在耳内，摇身一变，变作个麻雀儿，飞在树梢头钉住。</w:t>
       </w:r>
     </w:p>
     <w:p>
@@ -91,7 +91,7 @@
           <w:b w:val="0"/>
           <w:sz w:val="24"/>
         </w:rPr>
-        <w:t>1."掣棒"的"掣"读音和意思：A.chè拉、抽 B.zhì扔 C.chè跑 D.zhì举</w:t>
+        <w:t>1. 文中加点字"掣"的读音和意思正确的一项是（  ）</w:t>
       </w:r>
     </w:p>
     <w:p>
@@ -105,7 +105,7 @@
           <w:b w:val="0"/>
           <w:sz w:val="24"/>
         </w:rPr>
-        <w:t>2.书写正确：A.木木樗樗 法天象地 渺无踪迹 B.木木樗樗 法天像地</w:t>
+        <w:t>A. chè  拉、抽    B. zhì  扔、抛    C. chè  跑、逃    D. zhì  举、拿</w:t>
       </w:r>
     </w:p>
     <w:p>
@@ -119,7 +119,7 @@
           <w:b w:val="0"/>
           <w:sz w:val="24"/>
         </w:rPr>
-        <w:t>3."只情"的"情"：A.感情 B.情况 C.只管 D.情形</w:t>
+        <w:t>2. 下列词语书写完全正确的一项是（  ）</w:t>
       </w:r>
     </w:p>
     <w:p>
@@ -133,7 +133,7 @@
           <w:b w:val="0"/>
           <w:sz w:val="24"/>
         </w:rPr>
-        <w:t>4.没有语病：A.通过梳理使我们理解 B.斗法展现想象力 C.能否默读是标准 D.作者罗贯中</w:t>
+        <w:t>A. 木木樗樗  法天象地  渺无踪迹    B. 木木樗樗  法天像地  渺无踪迹</w:t>
       </w:r>
     </w:p>
     <w:p>
@@ -147,7 +147,147 @@
           <w:b w:val="0"/>
           <w:sz w:val="24"/>
         </w:rPr>
-        <w:t>5.排序：①变二郎入庙 ②变土地庙 ③变麻雀 ④败走被挡 → A.④③②①</w:t>
+        <w:t>C. 木木疏疏  法天象地  渺无踪影    D. 木木樗樗  法天象地  渺无踪影</w:t>
+      </w:r>
+    </w:p>
+    <w:p>
+      <w:pPr>
+        <w:spacing w:line="360" w:lineRule="auto"/>
+        <w:ind w:firstLine="420"/>
+      </w:pPr>
+      <w:r>
+        <w:rPr>
+          <w:rFonts w:ascii="宋体" w:hAnsi="宋体" w:eastAsia="宋体"/>
+          <w:b w:val="0"/>
+          <w:sz w:val="24"/>
+        </w:rPr>
+        <w:t>3. 文中"只情跑起"的"情"意思是（  ）</w:t>
+      </w:r>
+    </w:p>
+    <w:p>
+      <w:pPr>
+        <w:spacing w:line="360" w:lineRule="auto"/>
+        <w:ind w:firstLine="420"/>
+      </w:pPr>
+      <w:r>
+        <w:rPr>
+          <w:rFonts w:ascii="宋体" w:hAnsi="宋体" w:eastAsia="宋体"/>
+          <w:b w:val="0"/>
+          <w:sz w:val="24"/>
+        </w:rPr>
+        <w:t>A. 感情  B. 情况  C. 只管、只顾  D. 情形</w:t>
+      </w:r>
+    </w:p>
+    <w:p>
+      <w:pPr>
+        <w:spacing w:line="360" w:lineRule="auto"/>
+        <w:ind w:firstLine="420"/>
+      </w:pPr>
+      <w:r>
+        <w:rPr>
+          <w:rFonts w:ascii="宋体" w:hAnsi="宋体" w:eastAsia="宋体"/>
+          <w:b w:val="0"/>
+          <w:sz w:val="24"/>
+        </w:rPr>
+        <w:t>4. 下列句子没有语病的一项是（  ）</w:t>
+      </w:r>
+    </w:p>
+    <w:p>
+      <w:pPr>
+        <w:spacing w:line="360" w:lineRule="auto"/>
+        <w:ind w:firstLine="420"/>
+      </w:pPr>
+      <w:r>
+        <w:rPr>
+          <w:rFonts w:ascii="宋体" w:hAnsi="宋体" w:eastAsia="宋体"/>
+          <w:b w:val="0"/>
+          <w:sz w:val="24"/>
+        </w:rPr>
+        <w:t>A. 通过梳理斗法过程，使我们理解了神魔小说的想象艺术。</w:t>
+      </w:r>
+    </w:p>
+    <w:p>
+      <w:pPr>
+        <w:spacing w:line="360" w:lineRule="auto"/>
+        <w:ind w:firstLine="420"/>
+      </w:pPr>
+      <w:r>
+        <w:rPr>
+          <w:rFonts w:ascii="宋体" w:hAnsi="宋体" w:eastAsia="宋体"/>
+          <w:b w:val="0"/>
+          <w:sz w:val="24"/>
+        </w:rPr>
+        <w:t>B. 孙悟空与二郎神的斗法，展现了作者非凡的想象力。</w:t>
+      </w:r>
+    </w:p>
+    <w:p>
+      <w:pPr>
+        <w:spacing w:line="360" w:lineRule="auto"/>
+        <w:ind w:firstLine="420"/>
+      </w:pPr>
+      <w:r>
+        <w:rPr>
+          <w:rFonts w:ascii="宋体" w:hAnsi="宋体" w:eastAsia="宋体"/>
+          <w:b w:val="0"/>
+          <w:sz w:val="24"/>
+        </w:rPr>
+        <w:t>C. 能否快速默读，是衡量阅读能力高低的重要标准之一。</w:t>
+      </w:r>
+    </w:p>
+    <w:p>
+      <w:pPr>
+        <w:spacing w:line="360" w:lineRule="auto"/>
+        <w:ind w:firstLine="420"/>
+      </w:pPr>
+      <w:r>
+        <w:rPr>
+          <w:rFonts w:ascii="宋体" w:hAnsi="宋体" w:eastAsia="宋体"/>
+          <w:b w:val="0"/>
+          <w:sz w:val="24"/>
+        </w:rPr>
+        <w:t>D. 这篇课文选自《西游记》，作者是明代的罗贯中。</w:t>
+      </w:r>
+    </w:p>
+    <w:p>
+      <w:pPr>
+        <w:spacing w:line="360" w:lineRule="auto"/>
+        <w:ind w:firstLine="420"/>
+      </w:pPr>
+      <w:r>
+        <w:rPr>
+          <w:rFonts w:ascii="宋体" w:hAnsi="宋体" w:eastAsia="宋体"/>
+          <w:b w:val="0"/>
+          <w:sz w:val="24"/>
+        </w:rPr>
+        <w:t>5. 将下列情节按发生顺序排列，最恰当的一项是（  ）</w:t>
+      </w:r>
+    </w:p>
+    <w:p>
+      <w:pPr>
+        <w:spacing w:line="360" w:lineRule="auto"/>
+        <w:ind w:firstLine="420"/>
+      </w:pPr>
+      <w:r>
+        <w:rPr>
+          <w:rFonts w:ascii="宋体" w:hAnsi="宋体" w:eastAsia="宋体"/>
+          <w:b w:val="0"/>
+          <w:sz w:val="24"/>
+        </w:rPr>
+        <w:t>①变作二郎模样进入灌江口庙宇  ②变土地庙，尾巴变旗竿  ③变麻雀钉在树梢  ④败走遇四太尉二将军阻挡</w:t>
+      </w:r>
+    </w:p>
+    <w:p>
+      <w:pPr>
+        <w:spacing w:line="360" w:lineRule="auto"/>
+        <w:ind w:firstLine="420"/>
+      </w:pPr>
+      <w:r>
+        <w:rPr>
+          <w:rFonts w:ascii="宋体" w:hAnsi="宋体" w:eastAsia="宋体"/>
+          <w:b w:val="0"/>
+          <w:sz w:val="24"/>
+        </w:rPr>
+        <w:t>A. ④③②①  B. ③④②①  C. ④②③①  D. ③②④①</w:t>
       </w:r>
     </w:p>
     <w:p>
@@ -171,7 +311,7 @@
           <w:b w:val="0"/>
           <w:sz w:val="24"/>
         </w:rPr>
-        <w:t>6.作者________ 朝代________ 选自第________回</w:t>
+        <w:t>6. 《西游记》的作者是________，他生活在________（填朝代）。本文选自第________回。</w:t>
       </w:r>
     </w:p>
     <w:p>
@@ -185,7 +325,7 @@
           <w:b w:val="0"/>
           <w:sz w:val="24"/>
         </w:rPr>
-        <w:t>7.孙悟空经典情节两个：________、________</w:t>
+        <w:t>7. 孙悟空还有哪些经典情节？请写出两个：①________  ②________</w:t>
       </w:r>
     </w:p>
     <w:p>
@@ -199,7 +339,20 @@
           <w:b w:val="0"/>
           <w:sz w:val="24"/>
         </w:rPr>
-        <w:t>8.推荐孙悟空或二郎神，结合本文说理由（60字以上）</w:t>
+        <w:t>8. 假如学校文学社制作"名著人物智慧卡"，你会推荐孙悟空还是二郎神？请结合本文说说理由。（不少于60字）</w:t>
+      </w:r>
+    </w:p>
+    <w:p>
+      <w:pPr>
+        <w:spacing w:line="360" w:lineRule="auto"/>
+      </w:pPr>
+      <w:r>
+        <w:rPr>
+          <w:rFonts w:ascii="宋体" w:hAnsi="宋体" w:eastAsia="宋体"/>
+          <w:b w:val="0"/>
+          <w:sz w:val="24"/>
+        </w:rPr>
+        <w:t>__________________________________________________________</w:t>
       </w:r>
     </w:p>
     <w:p>
@@ -249,7 +402,48 @@
           <w:b w:val="0"/>
           <w:sz w:val="24"/>
         </w:rPr>
-        <w:t>9.概括"变土地庙"选段（40字内）</w:t>
+        <w:t>阅读课文选段，完成9—12题。</w:t>
+      </w:r>
+    </w:p>
+    <w:p>
+      <w:pPr>
+        <w:spacing w:line="360" w:lineRule="auto"/>
+        <w:ind w:firstLine="420"/>
+      </w:pPr>
+      <w:r>
+        <w:rPr>
+          <w:rFonts w:ascii="宋体" w:hAnsi="宋体" w:eastAsia="宋体"/>
+          <w:b w:val="0"/>
+          <w:sz w:val="24"/>
+        </w:rPr>
+        <w:t>那大圣趁着机会，滚下山崖，伏在那里又变，变了一座土地庙儿，大张着口，似个庙门，牙齿变做门扇，舌头变做菩萨，眼睛变做窗棂。只有尾巴不好收拾，竖在后面，变做一根旗竿。真君赶到崖下，不见打倒的鸨鸟，只有一间小庙，急睁凤眼，仔细看之，见旗竿立在后面，笑道：是这猢狲了！</w:t>
+      </w:r>
+    </w:p>
+    <w:p>
+      <w:pPr>
+        <w:spacing w:line="360" w:lineRule="auto"/>
+        <w:ind w:firstLine="420"/>
+      </w:pPr>
+      <w:r>
+        <w:rPr>
+          <w:rFonts w:ascii="宋体" w:hAnsi="宋体" w:eastAsia="宋体"/>
+          <w:b w:val="0"/>
+          <w:sz w:val="24"/>
+        </w:rPr>
+        <w:t>9. 用简洁的语言概括选段主要内容。（不超过40字）</w:t>
+      </w:r>
+    </w:p>
+    <w:p>
+      <w:pPr>
+        <w:spacing w:line="360" w:lineRule="auto"/>
+      </w:pPr>
+      <w:r>
+        <w:rPr>
+          <w:rFonts w:ascii="宋体" w:hAnsi="宋体" w:eastAsia="宋体"/>
+          <w:b w:val="0"/>
+          <w:sz w:val="24"/>
+        </w:rPr>
+        <w:t>__________________________________________________________</w:t>
       </w:r>
     </w:p>
     <w:p>
@@ -289,7 +483,7 @@
           <w:b w:val="0"/>
           <w:sz w:val="24"/>
         </w:rPr>
-        <w:t>10.尾巴变旗竿的细节作用（4分）</w:t>
+        <w:t>10. 孙悟空把尾巴变成旗竿，这一细节有什么作用？（4分）</w:t>
       </w:r>
     </w:p>
     <w:p>
@@ -329,7 +523,7 @@
           <w:b w:val="0"/>
           <w:sz w:val="24"/>
         </w:rPr>
-        <w:t>11.概括孙悟空、二郎神性格并各举依据（4分）</w:t>
+        <w:t>11. 结合课文，分别概括孙悟空和二郎神的性格特点，并各举一处课文依据。（4分）</w:t>
       </w:r>
     </w:p>
     <w:p>
@@ -369,7 +563,35 @@
           <w:b w:val="0"/>
           <w:sz w:val="24"/>
         </w:rPr>
-        <w:t>12.鲁迅说"使神魔皆有人情"——课文何处最能体现？（4分）</w:t>
+        <w:t>12. 阅读下面名家评论，完成问题。（4分）</w:t>
+      </w:r>
+    </w:p>
+    <w:p>
+      <w:pPr>
+        <w:spacing w:line="360" w:lineRule="auto"/>
+        <w:ind w:firstLine="420"/>
+      </w:pPr>
+      <w:r>
+        <w:rPr>
+          <w:rFonts w:ascii="宋体" w:hAnsi="宋体" w:eastAsia="宋体"/>
+          <w:b w:val="0"/>
+          <w:sz w:val="24"/>
+        </w:rPr>
+        <w:t>鲁迅说："虽述变幻恍忽之事，亦每杂解颐之言，使神魔皆有人情，精魅亦通世故。"</w:t>
+      </w:r>
+    </w:p>
+    <w:p>
+      <w:pPr>
+        <w:spacing w:line="360" w:lineRule="auto"/>
+        <w:ind w:firstLine="420"/>
+      </w:pPr>
+      <w:r>
+        <w:rPr>
+          <w:rFonts w:ascii="宋体" w:hAnsi="宋体" w:eastAsia="宋体"/>
+          <w:b w:val="0"/>
+          <w:sz w:val="24"/>
+        </w:rPr>
+        <w:t>（1）这句话指出了《西游记》怎样的艺术特点？</w:t>
       </w:r>
     </w:p>
     <w:p>
@@ -383,43 +605,6 @@
           <w:sz w:val="24"/>
         </w:rPr>
         <w:t>__________________________________________________________</w:t>
-      </w:r>
-    </w:p>
-    <w:p>
-      <w:pPr>
-        <w:spacing w:line="360" w:lineRule="auto"/>
-      </w:pPr>
-      <w:r>
-        <w:rPr>
-          <w:rFonts w:ascii="宋体" w:hAnsi="宋体" w:eastAsia="宋体"/>
-          <w:b w:val="0"/>
-          <w:sz w:val="24"/>
-        </w:rPr>
-        <w:t>__________________________________________________________</w:t>
-      </w:r>
-    </w:p>
-    <w:p>
-      <w:r>
-        <w:rPr>
-          <w:rFonts w:ascii="黑体" w:hAnsi="黑体" w:eastAsia="黑体"/>
-          <w:b/>
-          <w:sz w:val="28"/>
-        </w:rPr>
-        <w:t>四、语言运用（共10分）</w:t>
-      </w:r>
-    </w:p>
-    <w:p>
-      <w:pPr>
-        <w:spacing w:line="360" w:lineRule="auto"/>
-        <w:ind w:firstLine="420"/>
-      </w:pPr>
-      <w:r>
-        <w:rPr>
-          <w:rFonts w:ascii="宋体" w:hAnsi="宋体" w:eastAsia="宋体"/>
-          <w:b w:val="0"/>
-          <w:sz w:val="24"/>
-        </w:rPr>
-        <w:t>13.写80字推荐语，点明想象特色，联系"自由与规则"</w:t>
       </w:r>
     </w:p>
     <w:p>
@@ -459,7 +644,186 @@
           <w:b w:val="0"/>
           <w:sz w:val="24"/>
         </w:rPr>
-        <w:t>14.续写：二郎神如何识破悟空变庙宇（100字以上）</w:t>
+        <w:t>（2）课文中的哪一处情节最能体现"游戏般的童话气氛"？请举例说明。</w:t>
+      </w:r>
+    </w:p>
+    <w:p>
+      <w:pPr>
+        <w:spacing w:line="360" w:lineRule="auto"/>
+      </w:pPr>
+      <w:r>
+        <w:rPr>
+          <w:rFonts w:ascii="宋体" w:hAnsi="宋体" w:eastAsia="宋体"/>
+          <w:b w:val="0"/>
+          <w:sz w:val="24"/>
+        </w:rPr>
+        <w:t>__________________________________________________________</w:t>
+      </w:r>
+    </w:p>
+    <w:p>
+      <w:pPr>
+        <w:spacing w:line="360" w:lineRule="auto"/>
+      </w:pPr>
+      <w:r>
+        <w:rPr>
+          <w:rFonts w:ascii="宋体" w:hAnsi="宋体" w:eastAsia="宋体"/>
+          <w:b w:val="0"/>
+          <w:sz w:val="24"/>
+        </w:rPr>
+        <w:t>__________________________________________________________</w:t>
+      </w:r>
+    </w:p>
+    <w:p>
+      <w:r>
+        <w:rPr>
+          <w:rFonts w:ascii="黑体" w:hAnsi="黑体" w:eastAsia="黑体"/>
+          <w:b/>
+          <w:sz w:val="28"/>
+        </w:rPr>
+        <w:t>四、语言运用（共6分）</w:t>
+      </w:r>
+    </w:p>
+    <w:p>
+      <w:pPr>
+        <w:spacing w:line="360" w:lineRule="auto"/>
+        <w:ind w:firstLine="420"/>
+      </w:pPr>
+      <w:r>
+        <w:rPr>
+          <w:rFonts w:ascii="宋体" w:hAnsi="宋体" w:eastAsia="宋体"/>
+          <w:b w:val="0"/>
+          <w:sz w:val="24"/>
+        </w:rPr>
+        <w:t>13. 班级开展"神魔小说大家谈"活动，请你为《小圣施威降大圣》写一段80字左右的推荐语，要求：点明想象特色，联系"自由与规则"的思考。</w:t>
+      </w:r>
+    </w:p>
+    <w:p>
+      <w:pPr>
+        <w:spacing w:line="360" w:lineRule="auto"/>
+      </w:pPr>
+      <w:r>
+        <w:rPr>
+          <w:rFonts w:ascii="宋体" w:hAnsi="宋体" w:eastAsia="宋体"/>
+          <w:b w:val="0"/>
+          <w:sz w:val="24"/>
+        </w:rPr>
+        <w:t>__________________________________________________________</w:t>
+      </w:r>
+    </w:p>
+    <w:p>
+      <w:pPr>
+        <w:spacing w:line="360" w:lineRule="auto"/>
+      </w:pPr>
+      <w:r>
+        <w:rPr>
+          <w:rFonts w:ascii="宋体" w:hAnsi="宋体" w:eastAsia="宋体"/>
+          <w:b w:val="0"/>
+          <w:sz w:val="24"/>
+        </w:rPr>
+        <w:t>__________________________________________________________</w:t>
+      </w:r>
+    </w:p>
+    <w:p>
+      <w:pPr>
+        <w:spacing w:line="360" w:lineRule="auto"/>
+        <w:ind w:firstLine="420"/>
+      </w:pPr>
+      <w:r>
+        <w:rPr>
+          <w:rFonts w:ascii="宋体" w:hAnsi="宋体" w:eastAsia="宋体"/>
+          <w:b w:val="0"/>
+          <w:sz w:val="24"/>
+        </w:rPr>
+        <w:t>14. 情境默写：当同学争论"规则是否限制自由"时，你可以引用本课内容说：孙悟空神通广大，却也在天庭规则与二郎神的追捕中懂得________。这启示我们：________。</w:t>
+      </w:r>
+    </w:p>
+    <w:p>
+      <w:pPr>
+        <w:spacing w:line="360" w:lineRule="auto"/>
+      </w:pPr>
+      <w:r>
+        <w:rPr>
+          <w:rFonts w:ascii="宋体" w:hAnsi="宋体" w:eastAsia="宋体"/>
+          <w:b w:val="0"/>
+          <w:sz w:val="24"/>
+        </w:rPr>
+        <w:t>__________________________________________________________</w:t>
+      </w:r>
+    </w:p>
+    <w:p>
+      <w:pPr>
+        <w:spacing w:line="360" w:lineRule="auto"/>
+      </w:pPr>
+      <w:r>
+        <w:rPr>
+          <w:rFonts w:ascii="宋体" w:hAnsi="宋体" w:eastAsia="宋体"/>
+          <w:b w:val="0"/>
+          <w:sz w:val="24"/>
+        </w:rPr>
+        <w:t>__________________________________________________________</w:t>
+      </w:r>
+    </w:p>
+    <w:p>
+      <w:pPr>
+        <w:spacing w:line="360" w:lineRule="auto"/>
+      </w:pPr>
+      <w:r>
+        <w:rPr>
+          <w:rFonts w:ascii="宋体" w:hAnsi="宋体" w:eastAsia="宋体"/>
+          <w:b w:val="0"/>
+          <w:sz w:val="24"/>
+        </w:rPr>
+        <w:t>__________________________________________________________</w:t>
+      </w:r>
+    </w:p>
+    <w:p>
+      <w:r>
+        <w:rPr>
+          <w:rFonts w:ascii="黑体" w:hAnsi="黑体" w:eastAsia="黑体"/>
+          <w:b/>
+          <w:sz w:val="28"/>
+        </w:rPr>
+        <w:t>五、小练笔（共4分）</w:t>
+      </w:r>
+    </w:p>
+    <w:p>
+      <w:pPr>
+        <w:spacing w:line="360" w:lineRule="auto"/>
+        <w:ind w:firstLine="420"/>
+      </w:pPr>
+      <w:r>
+        <w:rPr>
+          <w:rFonts w:ascii="宋体" w:hAnsi="宋体" w:eastAsia="宋体"/>
+          <w:b w:val="0"/>
+          <w:sz w:val="24"/>
+        </w:rPr>
+        <w:t>15. 课文结尾，孙悟空变作二郎真君模样。假如你是二郎神，你会如何识破？发挥合理想象，写一段不少于100字的文字。</w:t>
+      </w:r>
+    </w:p>
+    <w:p>
+      <w:pPr>
+        <w:spacing w:line="360" w:lineRule="auto"/>
+      </w:pPr>
+      <w:r>
+        <w:rPr>
+          <w:rFonts w:ascii="宋体" w:hAnsi="宋体" w:eastAsia="宋体"/>
+          <w:b w:val="0"/>
+          <w:sz w:val="24"/>
+        </w:rPr>
+        <w:t>__________________________________________________________</w:t>
+      </w:r>
+    </w:p>
+    <w:p>
+      <w:pPr>
+        <w:spacing w:line="360" w:lineRule="auto"/>
+      </w:pPr>
+      <w:r>
+        <w:rPr>
+          <w:rFonts w:ascii="宋体" w:hAnsi="宋体" w:eastAsia="宋体"/>
+          <w:b w:val="0"/>
+          <w:sz w:val="24"/>
+        </w:rPr>
+        <w:t>__________________________________________________________</w:t>
       </w:r>
     </w:p>
     <w:p>
@@ -489,6 +853,7 @@
       </w:r>
     </w:p>
     <w:p/>
+    <w:p/>
     <w:p>
       <w:r>
         <w:rPr>
@@ -506,17 +871,7 @@
           <w:b/>
           <w:sz w:val="24"/>
         </w:rPr>
-        <w:t>一、1.A 2.A 3.C 4.B 5.A</w:t>
-      </w:r>
-    </w:p>
-    <w:p>
-      <w:r>
-        <w:rPr>
-          <w:rFonts w:ascii="黑体" w:hAnsi="黑体" w:eastAsia="黑体"/>
-          <w:b/>
-          <w:sz w:val="24"/>
-        </w:rPr>
-        <w:t>二、6.吴承恩；明代；六 7.大闹天宫；三借芭蕉扇等</w:t>
+        <w:t>一、积累与运用</w:t>
       </w:r>
     </w:p>
     <w:p>
@@ -530,7 +885,63 @@
           <w:b w:val="0"/>
           <w:sz w:val="24"/>
         </w:rPr>
-        <w:t>8.示例：推荐孙悟空。他机智善变、临危不乱，七十二变令人叹服；也启示我们：自由可贵，但须在规则中行。</w:t>
+        <w:t>1.A  【解析】本题考查字音字义。"掣"读chè，意为拉、抽，"掣棒"即抽棒。</w:t>
+      </w:r>
+    </w:p>
+    <w:p>
+      <w:pPr>
+        <w:spacing w:line="360" w:lineRule="auto"/>
+        <w:ind w:firstLine="420"/>
+      </w:pPr>
+      <w:r>
+        <w:rPr>
+          <w:rFonts w:ascii="宋体" w:hAnsi="宋体" w:eastAsia="宋体"/>
+          <w:b w:val="0"/>
+          <w:sz w:val="24"/>
+        </w:rPr>
+        <w:t>2.A  【解析】本题考查字形。"法天象地"的"象"指景象，不可写作"像"；"木木樗樗"形容呆板、丑陋。</w:t>
+      </w:r>
+    </w:p>
+    <w:p>
+      <w:pPr>
+        <w:spacing w:line="360" w:lineRule="auto"/>
+        <w:ind w:firstLine="420"/>
+      </w:pPr>
+      <w:r>
+        <w:rPr>
+          <w:rFonts w:ascii="宋体" w:hAnsi="宋体" w:eastAsia="宋体"/>
+          <w:b w:val="0"/>
+          <w:sz w:val="24"/>
+        </w:rPr>
+        <w:t>3.C  【解析】本题考查古今异义/通假。"只情"即"只管"，与课下注释一致。</w:t>
+      </w:r>
+    </w:p>
+    <w:p>
+      <w:pPr>
+        <w:spacing w:line="360" w:lineRule="auto"/>
+        <w:ind w:firstLine="420"/>
+      </w:pPr>
+      <w:r>
+        <w:rPr>
+          <w:rFonts w:ascii="宋体" w:hAnsi="宋体" w:eastAsia="宋体"/>
+          <w:b w:val="0"/>
+          <w:sz w:val="24"/>
+        </w:rPr>
+        <w:t>4.B  【解析】A项缺主语，应删"通过"或"使"；C项两面对一面；D项作者应为吴承恩。</w:t>
+      </w:r>
+    </w:p>
+    <w:p>
+      <w:pPr>
+        <w:spacing w:line="360" w:lineRule="auto"/>
+        <w:ind w:firstLine="420"/>
+      </w:pPr>
+      <w:r>
+        <w:rPr>
+          <w:rFonts w:ascii="宋体" w:hAnsi="宋体" w:eastAsia="宋体"/>
+          <w:b w:val="0"/>
+          <w:sz w:val="24"/>
+        </w:rPr>
+        <w:t>5.A  【解析】按课文顺序：先败走被挡（④），再变麻雀（③），后变土地庙（②），最后到灌江口（①）。</w:t>
       </w:r>
     </w:p>
     <w:p>
@@ -540,7 +951,49 @@
           <w:b/>
           <w:sz w:val="24"/>
         </w:rPr>
-        <w:t>三、9.悟空变庙，旗竿暴露被识破。10.推动情节，显幽默与游戏笔法。11.悟空机智；二郎细心（需结合课文）。12.变花鸨、变庙宇等富人情童趣。</w:t>
+        <w:t>二、名著阅读</w:t>
+      </w:r>
+    </w:p>
+    <w:p>
+      <w:pPr>
+        <w:spacing w:line="360" w:lineRule="auto"/>
+        <w:ind w:firstLine="420"/>
+      </w:pPr>
+      <w:r>
+        <w:rPr>
+          <w:rFonts w:ascii="宋体" w:hAnsi="宋体" w:eastAsia="宋体"/>
+          <w:b w:val="0"/>
+          <w:sz w:val="24"/>
+        </w:rPr>
+        <w:t>6. 吴承恩；明代；六（或"第六回"）</w:t>
+      </w:r>
+    </w:p>
+    <w:p>
+      <w:pPr>
+        <w:spacing w:line="360" w:lineRule="auto"/>
+        <w:ind w:firstLine="420"/>
+      </w:pPr>
+      <w:r>
+        <w:rPr>
+          <w:rFonts w:ascii="宋体" w:hAnsi="宋体" w:eastAsia="宋体"/>
+          <w:b w:val="0"/>
+          <w:sz w:val="24"/>
+        </w:rPr>
+        <w:t>7. 示例：大闹天宫；三借芭蕉扇；三打白骨精；真假美猴王（任写两个）</w:t>
+      </w:r>
+    </w:p>
+    <w:p>
+      <w:pPr>
+        <w:spacing w:line="360" w:lineRule="auto"/>
+        <w:ind w:firstLine="420"/>
+      </w:pPr>
+      <w:r>
+        <w:rPr>
+          <w:rFonts w:ascii="宋体" w:hAnsi="宋体" w:eastAsia="宋体"/>
+          <w:b w:val="0"/>
+          <w:sz w:val="24"/>
+        </w:rPr>
+        <w:t>8. 【示例】我推荐孙悟空。他面对二郎神追捕，能临危不乱、随机应变，由麻雀到大鹚老、鱼儿、水蛇、花鸨、土地庙，变化层出不穷；虽桀骜好胜，却机智勇敢。读这一回，既能感受想象的奇趣，也能思考自由与规则的关系。</w:t>
       </w:r>
     </w:p>
     <w:p>
@@ -550,7 +1003,139 @@
           <w:b/>
           <w:sz w:val="24"/>
         </w:rPr>
-        <w:t>四、13.示例：一回精彩斗法，既见想象奇趣，也思自由与规则。14.示例：二郎指出庙宇不该有旗竿后识破。（合理即可）</w:t>
+        <w:t>三、阅读理解</w:t>
+      </w:r>
+    </w:p>
+    <w:p>
+      <w:pPr>
+        <w:spacing w:line="360" w:lineRule="auto"/>
+        <w:ind w:firstLine="420"/>
+      </w:pPr>
+      <w:r>
+        <w:rPr>
+          <w:rFonts w:ascii="宋体" w:hAnsi="宋体" w:eastAsia="宋体"/>
+          <w:b w:val="0"/>
+          <w:sz w:val="24"/>
+        </w:rPr>
+        <w:t>9. 孙悟空变作土地庙，因尾巴变旗竿暴露，被二郎神识破。（意思对即可）</w:t>
+      </w:r>
+    </w:p>
+    <w:p>
+      <w:pPr>
+        <w:spacing w:line="360" w:lineRule="auto"/>
+        <w:ind w:firstLine="420"/>
+      </w:pPr>
+      <w:r>
+        <w:rPr>
+          <w:rFonts w:ascii="宋体" w:hAnsi="宋体" w:eastAsia="宋体"/>
+          <w:b w:val="0"/>
+          <w:sz w:val="24"/>
+        </w:rPr>
+        <w:t>10. 这一细节既表现了孙悟空变化时"尾巴不好收拾"的窘迫，留下破绽，推动情节发展；又以幽默、生活化的想象制造笑点，体现神魔小说"游戏笔法"和"人情味"，使奇幻情节显得真实可感。</w:t>
+      </w:r>
+    </w:p>
+    <w:p>
+      <w:pPr>
+        <w:spacing w:line="360" w:lineRule="auto"/>
+        <w:ind w:firstLine="420"/>
+      </w:pPr>
+      <w:r>
+        <w:rPr>
+          <w:rFonts w:ascii="宋体" w:hAnsi="宋体" w:eastAsia="宋体"/>
+          <w:b w:val="0"/>
+          <w:sz w:val="24"/>
+        </w:rPr>
+        <w:t>11. 孙悟空：机智善变、桀骜不驯。依据：败走中迅速变麻雀、鱼儿等脱身。二郎神：细心谨慎、执法严明。依据：由旗竿识破土地庙，或紧追不舍、变化相克。</w:t>
+      </w:r>
+    </w:p>
+    <w:p>
+      <w:pPr>
+        <w:spacing w:line="360" w:lineRule="auto"/>
+        <w:ind w:firstLine="420"/>
+      </w:pPr>
+      <w:r>
+        <w:rPr>
+          <w:rFonts w:ascii="宋体" w:hAnsi="宋体" w:eastAsia="宋体"/>
+          <w:b w:val="0"/>
+          <w:sz w:val="24"/>
+        </w:rPr>
+        <w:t>12.（1）神魔形象具有人情味，情节在奇幻中透出幽默与生活智慧。（2）示例：孙悟空变花鸨"木木樗樗"立在蓼汀，二郎神"见他变得低贱，故此不去拢傍"，充满游戏感与儿童情趣。</w:t>
+      </w:r>
+    </w:p>
+    <w:p>
+      <w:r>
+        <w:rPr>
+          <w:rFonts w:ascii="黑体" w:hAnsi="黑体" w:eastAsia="黑体"/>
+          <w:b/>
+          <w:sz w:val="24"/>
+        </w:rPr>
+        <w:t>四、语言运用</w:t>
+      </w:r>
+    </w:p>
+    <w:p>
+      <w:pPr>
+        <w:spacing w:line="360" w:lineRule="auto"/>
+        <w:ind w:firstLine="420"/>
+      </w:pPr>
+      <w:r>
+        <w:rPr>
+          <w:rFonts w:ascii="宋体" w:hAnsi="宋体" w:eastAsia="宋体"/>
+          <w:b w:val="0"/>
+          <w:sz w:val="24"/>
+        </w:rPr>
+        <w:t>13. 【示例】《小圣施威降大圣》是一回"以变制变"的精彩斗法。作者用连环变化写出神魔世界的奇趣，也写出孙悟空的机敏与二郎神的果决。它告诉我们：追求自由应有边界，再强的本领也要在规则中行事。</w:t>
+      </w:r>
+    </w:p>
+    <w:p>
+      <w:pPr>
+        <w:spacing w:line="360" w:lineRule="auto"/>
+        <w:ind w:firstLine="420"/>
+      </w:pPr>
+      <w:r>
+        <w:rPr>
+          <w:rFonts w:ascii="宋体" w:hAnsi="宋体" w:eastAsia="宋体"/>
+          <w:b w:val="0"/>
+          <w:sz w:val="24"/>
+        </w:rPr>
+        <w:t>14. 示例：收敛与边界；自由可贵，但要在规则与责任中行使。（言之有理即可）</w:t>
+      </w:r>
+    </w:p>
+    <w:p>
+      <w:r>
+        <w:rPr>
+          <w:rFonts w:ascii="黑体" w:hAnsi="黑体" w:eastAsia="黑体"/>
+          <w:b/>
+          <w:sz w:val="24"/>
+        </w:rPr>
+        <w:t>五、小练笔</w:t>
+      </w:r>
+    </w:p>
+    <w:p>
+      <w:pPr>
+        <w:spacing w:line="360" w:lineRule="auto"/>
+        <w:ind w:firstLine="420"/>
+      </w:pPr>
+      <w:r>
+        <w:rPr>
+          <w:rFonts w:ascii="宋体" w:hAnsi="宋体" w:eastAsia="宋体"/>
+          <w:b w:val="0"/>
+          <w:sz w:val="24"/>
+        </w:rPr>
+        <w:t>15. 【示例】二郎神赶到庙前，并不急于动手，只朗声道："孙猴子，你变得倒像，却忘了灌江口庙宇向来只有香炉并无旗竿！"大圣心头一紧，正欲再变，真君已化作鹞子扑向旗竿。猴王哈哈一笑，纵云而起："二郎哥眼睛真尖！这一局算你赢半招！"二人又斗在一处。</w:t>
+      </w:r>
+    </w:p>
+    <w:p>
+      <w:pPr>
+        <w:spacing w:line="360" w:lineRule="auto"/>
+        <w:ind w:firstLine="420"/>
+      </w:pPr>
+      <w:r>
+        <w:rPr>
+          <w:rFonts w:ascii="宋体" w:hAnsi="宋体" w:eastAsia="宋体"/>
+          <w:b w:val="0"/>
+          <w:sz w:val="24"/>
+        </w:rPr>
+        <w:t>【评分建议】想象合理2分，符合人物性格1分，语言通顺1分。</w:t>
       </w:r>
     </w:p>
     <w:sectPr>

</xml_diff>